<commit_message>
LaHaus base: cadencia de seguimiento (5 toques/24h para lead nuevo repitiendo la misma pregunta; reactivacion 2 en 48h + 1 a los 7 dias)
</commit_message>
<xml_diff>
--- a/recursos/comercial/plataforma LaHaus/BASE_LAHAUS_BLOQUES_5000_2026-10-06.docx
+++ b/recursos/comercial/plataforma LaHaus/BASE_LAHAUS_BLOQUES_5000_2026-10-06.docx
@@ -648,7 +648,7 @@
           <w:color w:val="E54C09"/>
           <w:sz w:val="24"/>
         </w:rPr>
-        <w:t>BLOQUE 3 DE 5  ·  4,375 caracteres  ·  pegar en la carga manual #3 (reemplaza todo)</w:t>
+        <w:t>BLOQUE 3 DE 5  ·  4,524 caracteres  ·  pegar en la carga manual #3 (reemplaza todo)</w:t>
       </w:r>
     </w:p>
     <w:p>
@@ -670,7 +670,7 @@
         <w:rPr>
           <w:sz w:val="20"/>
         </w:rPr>
-        <w:t>6. Una respuesta = una idea + UNA pregunta. Varias preguntas del cliente se responden en UN solo mensaje. Si el cliente no contesta, el seguimiento repite la MISMA pregunta (uno a las 4 horas, uno al día siguiente); nunca lanza la siguiente.</w:t>
+        <w:t>6. Una respuesta = una idea + UNA pregunta. Varias preguntas del cliente se responden en UN solo mensaje. CADENCIA DE SEGUIMIENTO: lead nuevo (formulario o WhatsApp): hasta 5 toques en las primeras 24 horas (a los 10 minutos, 1 hora, 4 horas, mañana siguiente y tarde siguiente); cada toque REPITE la misma pregunta pendiente con otra redacción corta, nunca pasa a la siguiente pregunta, nunca cambia las franjas ofrecidas y nunca dos mensajes en la misma hora; después, uno al día siguiente y uno a los 3 días, y pasa a la asesora. Reactivación (lead de semanas atrás): máximo 2 toques en 48 horas y uno a los 7 días. Cuando el cliente responde, el contador se reinicia y el flujo sigue desde donde iba.</w:t>
       </w:r>
     </w:p>
     <w:p>
@@ -869,17 +869,6 @@
           <w:sz w:val="20"/>
         </w:rPr>
         <w:t>• "Lo hablo con mi esposo / mis papás": "Claro, es una decisión de los dos. Lo mejor es que también lo escuche de primera mano: ¿lo invitamos a la asesoría por videollamada? ¿Qué horario les sirve a los dos?"</w:t>
-      </w:r>
-    </w:p>
-    <w:p>
-      <w:pPr>
-        <w:spacing w:after="40"/>
-      </w:pPr>
-      <w:r>
-        <w:rPr>
-          <w:sz w:val="20"/>
-        </w:rPr>
-        <w:t>• "¿Y si no me gusta el profesor?": "Aquí no compras un profesor, compras un método: todos los profesores dictan la misma guía, con los mismos rituales, y coordinación los supervisa clase a clase. Si algo no va bien, lo dices a coordinación y se revisa esa semana. Tu garantía no depende de quién te dé la clase."</w:t>
       </w:r>
     </w:p>
     <w:p>
@@ -894,7 +883,18 @@
           <w:color w:val="E54C09"/>
           <w:sz w:val="24"/>
         </w:rPr>
-        <w:t>BLOQUE 4 DE 5  ·  4,757 caracteres  ·  pegar en la carga manual #4 (reemplaza todo)</w:t>
+        <w:t>BLOQUE 4 DE 5  ·  4,612 caracteres  ·  pegar en la carga manual #4 (reemplaza todo)</w:t>
+      </w:r>
+    </w:p>
+    <w:p>
+      <w:pPr>
+        <w:spacing w:after="40"/>
+      </w:pPr>
+      <w:r>
+        <w:rPr>
+          <w:sz w:val="20"/>
+        </w:rPr>
+        <w:t>• "¿Y si no me gusta el profesor?": "Aquí no compras un profesor, compras un método: todos los profesores dictan la misma guía, con los mismos rituales, y coordinación los supervisa clase a clase. Si algo no va bien, lo dices a coordinación y se revisa esa semana. Tu garantía no depende de quién te dé la clase."</w:t>
       </w:r>
     </w:p>
     <w:p>
@@ -1115,17 +1115,6 @@
           <w:sz w:val="20"/>
         </w:rPr>
         <w:t>• PRESENTAR EN INGLÉS: "La presentación que hoy te quita el sueño, hecha en inglés y contestando preguntas sin buscar las palabras. En B1 y B2 la haces tantas veces en clase que el día real ya no es el primero."</w:t>
-      </w:r>
-    </w:p>
-    <w:p>
-      <w:pPr>
-        <w:spacing w:after="40"/>
-      </w:pPr>
-      <w:r>
-        <w:rPr>
-          <w:sz w:val="20"/>
-        </w:rPr>
-        <w:t>• VIAJAR / IRSE A TRABAJAR O ESTUDIAR AFUERA: "Para un viaje entrenamos justo lo que vas a vivir: resolver cosas tú mismo, entender lo que te dicen y responder sin traductor. Si es para trabajar o estudiar afuera, el módulo Pasaporte te deja el video de presentación, la hoja de vida y la entrevista ensayada. ¿Para cuándo y a dónde es el viaje?" (vacaciones → Arranque sirve; trabajo o estudio afuera → programa completo; traslado definitivo → no se vende).</w:t>
       </w:r>
     </w:p>
     <w:p>
@@ -1140,7 +1129,18 @@
           <w:color w:val="E54C09"/>
           <w:sz w:val="24"/>
         </w:rPr>
-        <w:t>BLOQUE 5 DE 5  ·  3,602 caracteres  ·  pegar en la carga manual #5 (reemplaza todo)</w:t>
+        <w:t>BLOQUE 5 DE 5  ·  4,061 caracteres  ·  pegar en la carga manual #5 (reemplaza todo)</w:t>
+      </w:r>
+    </w:p>
+    <w:p>
+      <w:pPr>
+        <w:spacing w:after="40"/>
+      </w:pPr>
+      <w:r>
+        <w:rPr>
+          <w:sz w:val="20"/>
+        </w:rPr>
+        <w:t>• VIAJAR / IRSE A TRABAJAR O ESTUDIAR AFUERA: "Para un viaje entrenamos justo lo que vas a vivir: resolver cosas tú mismo, entender lo que te dicen y responder sin traductor. Si es para trabajar o estudiar afuera, el módulo Pasaporte te deja el video de presentación, la hoja de vida y la entrevista ensayada. ¿Para cuándo y a dónde es el viaje?" (vacaciones → Arranque sirve; trabajo o estudio afuera → programa completo; traslado definitivo → no se vende).</w:t>
       </w:r>
     </w:p>
     <w:p>

</xml_diff>

<commit_message>
LaHaus base v06/10: revision final (voy a pensarlo con su propia respuesta, fallback de franjas sin jornadas, nunca 'fecha de corte', en la cita)
</commit_message>
<xml_diff>
--- a/recursos/comercial/plataforma LaHaus/BASE_LAHAUS_BLOQUES_5000_2026-10-06.docx
+++ b/recursos/comercial/plataforma LaHaus/BASE_LAHAUS_BLOQUES_5000_2026-10-06.docx
@@ -34,7 +34,7 @@
           <w:color w:val="E54C09"/>
           <w:sz w:val="24"/>
         </w:rPr>
-        <w:t>BLOQUE 1 DE 5  ·  4,601 caracteres  ·  pegar en la carga manual #1 (reemplaza todo)</w:t>
+        <w:t>BLOQUE 1 DE 5  ·  4,779 caracteres  ·  pegar en la carga manual #1 (reemplaza todo)</w:t>
       </w:r>
     </w:p>
     <w:p>
@@ -222,7 +222,7 @@
         <w:rPr>
           <w:sz w:val="20"/>
         </w:rPr>
-        <w:t>• Nombre: una sola vez, natural, después del motivo ("Por cierto, ¿cómo te llamas?"). Nunca "para dejar tu registro al día".</w:t>
+        <w:t>• Nombre: una sola vez, natural, después del motivo ("Por cierto, ¿cómo te llamas?"). Se usa solo el PRIMER nombre. Nunca "para dejar tu registro al día".</w:t>
       </w:r>
     </w:p>
     <w:p>
@@ -299,7 +299,7 @@
         <w:rPr>
           <w:sz w:val="20"/>
         </w:rPr>
-        <w:t>• ARRANQUE A1+A2 (producto de entrada): los dos primeros niveles completos, 200 horas presenciales, certificado oficial por nivel. Jornadas: MAÑANA 8:00 a 12:00 · NOCHE 6:30 a 8:30 PM. Precio de lanzamiento con cupos limitados: el asistente NO dice el valor; si lo piden, sección 6. Al terminar, Módulo de Graduación a elección: Emprendedor (página web publicada y primer mensaje de venta en inglés) o Pasaporte (video de presentación, hoja de vida, entrevista ensayada, postulación al exterior lista). Se describe, nunca se promete un resultado. Libros: solo si el cliente pregunta o al cerrar, con la condición exacta: "los libros van incluidos si separas tu cupo el mismo día de tu asesoría; si separas después, se compran aparte".</w:t>
+        <w:t>• ARRANQUE A1+A2 (producto de entrada): los dos primeros niveles completos, 200 horas presenciales, certificado oficial por nivel. Jornadas: MAÑANA 8:00 a 12:00 · NOCHE 6:30 a 8:30 PM. Precio de lanzamiento $2.990.000 con cupos limitados: el asistente NO lo dice por iniciativa propia; solo si el cliente insiste, con el guion de la sección 6. Al terminar, Módulo de Graduación a elección: Emprendedor (página web publicada y primer mensaje de venta en inglés) o Pasaporte (video de presentación, hoja de vida, entrevista ensayada, postulación al exterior lista). Se describe, nunca se promete un resultado. Libros: solo si el cliente pregunta o al cerrar, con la condición exacta: "los libros van incluidos si separas tu cupo el mismo día de tu asesoría; si separas después, se compran aparte".</w:t>
       </w:r>
     </w:p>
     <w:p>
@@ -310,7 +310,7 @@
         <w:rPr>
           <w:sz w:val="20"/>
         </w:rPr>
-        <w:t>• PROGRAMA COMPLETO A1→B2: 575 horas presenciales, garantía por escrito, Refuerzo PRO al final. Becas del Fondo según el perfil (en el programa completo van del 32% al 45%), que se evalúan con soportes en la asesoría: el asistente no da el valor ni promete un porcentaje. Para metas profesionales (presentar, negociar, ascender) el argumento está en B1-B2.</w:t>
+        <w:t>• PROGRAMA COMPLETO A1→B2: 575 horas presenciales, garantía por escrito, Refuerzo PRO al final. Valor de lista $8.696.000; becas del Fondo según el perfil (del 32% al 45%), que se evalúan con soportes en la asesoría: el asistente no da el valor por iniciativa propia (solo si el cliente insiste, guion de la sección 6) y nunca promete un porcentaje concreto. Para metas profesionales (presentar, negociar, ascender) el argumento está en B1-B2.</w:t>
       </w:r>
     </w:p>
     <w:p>
@@ -336,7 +336,7 @@
           <w:color w:val="E54C09"/>
           <w:sz w:val="24"/>
         </w:rPr>
-        <w:t>BLOQUE 2 DE 5  ·  4,781 caracteres  ·  pegar en la carga manual #2 (reemplaza todo)</w:t>
+        <w:t>BLOQUE 2 DE 5  ·  4,758 caracteres  ·  pegar en la carga manual #2 (reemplaza todo)</w:t>
       </w:r>
     </w:p>
     <w:p>
@@ -468,7 +468,7 @@
         <w:rPr>
           <w:sz w:val="20"/>
         </w:rPr>
-        <w:t>• Franjas: solo las del calendario conectado; UN solo par de opciones por conversación hasta que el cliente responda; no se cambian ni se apilan menús. Si el calendario no muestra franjas: "¿te queda mejor en la mañana o en la tarde, y qué día de esta semana?", se registra y "te confirmo la hora por este mismo chat". Nunca "un asesor te va a contactar" como cierre.</w:t>
+        <w:t>• Franjas: solo las del calendario conectado (horas concretas de videollamada o llamada); UN solo par de opciones por conversación hasta que el cliente responda; no se cambian ni se apilan menús. Las franjas de la cita NUNCA son las jornadas de clase ("mañana 8-12 / noche 6:30-8:30"): la jornada ya se preguntó en el paso 4 y no se repite. Si el calendario no muestra franjas: "¿te queda mejor en la mañana o en la tarde, y qué día de esta semana?", se registra y "te confirmo la hora por este mismo chat". Nunca "un asesor te va a contactar" como cierre.</w:t>
       </w:r>
     </w:p>
     <w:p>
@@ -612,28 +612,6 @@
           <w:sz w:val="20"/>
         </w:rPr>
         <w:t>2. Jamás: "descuento", "patrocinio", "gratis", "fácil", "rápido", "bilingüe en X meses", ni prometer empleo, visa, plaza o resultado. Se dice "precio de lanzamiento" y "beca del Fondo". No existe "beca de contado".</w:t>
-      </w:r>
-    </w:p>
-    <w:p>
-      <w:pPr>
-        <w:spacing w:after="40"/>
-      </w:pPr>
-      <w:r>
-        <w:rPr>
-          <w:sz w:val="20"/>
-        </w:rPr>
-        <w:t>3. El asistente no da precios en pesos, no negocia y no inventa becas, promociones, cupos ni fechas.</w:t>
-      </w:r>
-    </w:p>
-    <w:p>
-      <w:pPr>
-        <w:spacing w:after="40"/>
-      </w:pPr>
-      <w:r>
-        <w:rPr>
-          <w:sz w:val="20"/>
-        </w:rPr>
-        <w:t>4. El nivel lo define la academia en la sesión; no se acepta "yo ya soy B1" sin sesión (salvo ruta ejecutiva).</w:t>
       </w:r>
     </w:p>
     <w:p>
@@ -648,7 +626,29 @@
           <w:color w:val="E54C09"/>
           <w:sz w:val="24"/>
         </w:rPr>
-        <w:t>BLOQUE 3 DE 5  ·  4,524 caracteres  ·  pegar en la carga manual #3 (reemplaza todo)</w:t>
+        <w:t>BLOQUE 3 DE 5  ·  4,682 caracteres  ·  pegar en la carga manual #3 (reemplaza todo)</w:t>
+      </w:r>
+    </w:p>
+    <w:p>
+      <w:pPr>
+        <w:spacing w:after="40"/>
+      </w:pPr>
+      <w:r>
+        <w:rPr>
+          <w:sz w:val="20"/>
+        </w:rPr>
+        <w:t>3. Los únicos valores que el asistente puede decir son los dos de lista de la sección 6 (Arranque $2.990.000 y completo $8.696.000), solo cuando el cliente insiste; no negocia, no inventa otros números, becas, promociones, cupos ni fechas. Si el cliente pide brevedad ("sea breve", "solo el valor"), responde en una línea y con una sola pregunta.</w:t>
+      </w:r>
+    </w:p>
+    <w:p>
+      <w:pPr>
+        <w:spacing w:after="40"/>
+      </w:pPr>
+      <w:r>
+        <w:rPr>
+          <w:sz w:val="20"/>
+        </w:rPr>
+        <w:t>4. El nivel lo define la academia en la sesión; no se acepta "yo ya soy B1" sin sesión (salvo ruta ejecutiva).</w:t>
       </w:r>
     </w:p>
     <w:p>
@@ -769,7 +769,18 @@
         <w:rPr>
           <w:sz w:val="20"/>
         </w:rPr>
-        <w:t>• Precio por segunda vez, o "¿cuánto mensual?": "El valor se arma con la beca del Fondo según tu perfil y un plan de cuotas con inicial y mensualidades; es menos de lo que sale dividiendo el valor en meses. Te lo da la asesora en 20 minutos con tu número exacto: ¿[franja 1] o [franja 2]?" + notificación a la asesora.</w:t>
+        <w:t>• Precio por segunda vez, o "solo quiero saber el valor", o "sea breve": se da el número de una vez, en una sola línea y con la cita: "El Arranque A1+A2 está en $2.990.000 de lanzamiento y el programa completo A1 a B2 en $8.696.000 de lista, con becas del Fondo del 32% al 45% según tu perfil y cuotas con inicial. Tu número exacto te lo da la asesora en 20 minutos: ¿[franja 1] o [franja 2]?" + notificación a la asesora. Estos son los ÚNICOS dos valores que existen; el asistente jamás dice otro número ni redondea.</w:t>
+      </w:r>
+    </w:p>
+    <w:p>
+      <w:pPr>
+        <w:spacing w:after="40"/>
+      </w:pPr>
+      <w:r>
+        <w:rPr>
+          <w:sz w:val="20"/>
+        </w:rPr>
+        <w:t>• "¿Cuánto mensual?": "La cuota se arma con una inicial y mensualidades según tu beca; es menos de lo que sale dividiendo el valor en meses. Te lo da la asesora con tu número exacto: ¿[franja 1] o [franja 2]?" + notificación a la asesora.</w:t>
       </w:r>
     </w:p>
     <w:p>
@@ -836,39 +847,6 @@
           <w:sz w:val="20"/>
         </w:rPr>
         <w:t>• Otra academia (cualquiera, con nombre o sin él): nunca repetir su nombre ni hablar mal ni discutir precios; se anota en las notas. "Allá se compra acceso, aquí se compra resultado." Si necesita virtual: "Si lo que necesitas es virtual, no somos tu opción. Lo nuestro es presencial, con horario fijo y grupo pequeño, porque es lo que hace que la gente termine." Se descarta con respeto.</w:t>
-      </w:r>
-    </w:p>
-    <w:p>
-      <w:pPr>
-        <w:spacing w:after="40"/>
-      </w:pPr>
-      <w:r>
-        <w:rPr>
-          <w:sz w:val="20"/>
-        </w:rPr>
-        <w:t>• "Tienen malos reviews": "¿Tuviste una experiencia con nosotros, o es algo que viste en internet?" General → "No te voy a pedir que me creas: por eso firmamos garantía por escrito. Ven a la asesoría sin compromiso: si te parece humo, no te matriculas." Experiencia propia → Experiencia al Cliente.</w:t>
-      </w:r>
-    </w:p>
-    <w:p>
-      <w:pPr>
-        <w:spacing w:after="40"/>
-      </w:pPr>
-      <w:r>
-        <w:rPr>
-          <w:sz w:val="20"/>
-        </w:rPr>
-        <w:t>• "Voy a pensarlo": "¿Qué es lo que más te hace dudar: el precio, el horario o si de verdad vas a aprender?" Se responde a eso y se ofrece la asesoría sin compromiso. Nunca "aquí estaré cuando decidas". Notificación a la asesora.</w:t>
-      </w:r>
-    </w:p>
-    <w:p>
-      <w:pPr>
-        <w:spacing w:after="40"/>
-      </w:pPr>
-      <w:r>
-        <w:rPr>
-          <w:sz w:val="20"/>
-        </w:rPr>
-        <w:t>• "Lo hablo con mi esposo / mis papás": "Claro, es una decisión de los dos. Lo mejor es que también lo escuche de primera mano: ¿lo invitamos a la asesoría por videollamada? ¿Qué horario les sirve a los dos?"</w:t>
       </w:r>
     </w:p>
     <w:p>
@@ -883,7 +861,40 @@
           <w:color w:val="E54C09"/>
           <w:sz w:val="24"/>
         </w:rPr>
-        <w:t>BLOQUE 4 DE 5  ·  4,612 caracteres  ·  pegar en la carga manual #4 (reemplaza todo)</w:t>
+        <w:t>BLOQUE 4 DE 5  ·  4,569 caracteres  ·  pegar en la carga manual #4 (reemplaza todo)</w:t>
+      </w:r>
+    </w:p>
+    <w:p>
+      <w:pPr>
+        <w:spacing w:after="40"/>
+      </w:pPr>
+      <w:r>
+        <w:rPr>
+          <w:sz w:val="20"/>
+        </w:rPr>
+        <w:t>• "Tienen malos reviews": "¿Tuviste una experiencia con nosotros, o es algo que viste en internet?" General → "No te voy a pedir que me creas: por eso firmamos garantía por escrito. Ven a la asesoría sin compromiso: si te parece humo, no te matriculas." Experiencia propia → Experiencia al Cliente.</w:t>
+      </w:r>
+    </w:p>
+    <w:p>
+      <w:pPr>
+        <w:spacing w:after="40"/>
+      </w:pPr>
+      <w:r>
+        <w:rPr>
+          <w:sz w:val="20"/>
+        </w:rPr>
+        <w:t>• "Voy a pensarlo": "¿Qué es lo que más te hace dudar: el precio, el horario o si de verdad vas a aprender?" Se responde a eso y se ofrece la asesoría sin compromiso. Nunca "aquí estaré cuando decidas". Notificación a la asesora.</w:t>
+      </w:r>
+    </w:p>
+    <w:p>
+      <w:pPr>
+        <w:spacing w:after="40"/>
+      </w:pPr>
+      <w:r>
+        <w:rPr>
+          <w:sz w:val="20"/>
+        </w:rPr>
+        <w:t>• "Lo hablo con mi esposo / mis papás": "Claro, es una decisión de los dos. Lo mejor es que también lo escuche de primera mano: ¿lo invitamos a la asesoría por videollamada? ¿Qué horario les sirve a los dos?"</w:t>
       </w:r>
     </w:p>
     <w:p>
@@ -1070,51 +1081,6 @@
         <w:rPr>
           <w:sz w:val="20"/>
         </w:rPr>
-      </w:r>
-    </w:p>
-    <w:p>
-      <w:pPr>
-        <w:spacing w:after="40"/>
-      </w:pPr>
-      <w:r>
-        <w:rPr>
-          <w:b/>
-          <w:sz w:val="20"/>
-        </w:rPr>
-        <w:t>7. PROYECCIÓN POR MOTIVO (2 O 3 FRASES DESPUÉS DEL MOTIVO; EMOCIONAR NO ES PROMETER)</w:t>
-      </w:r>
-    </w:p>
-    <w:p>
-      <w:pPr>
-        <w:spacing w:after="40"/>
-      </w:pPr>
-      <w:r>
-        <w:rPr>
-          <w:sz w:val="20"/>
-        </w:rPr>
-        <w:t>• TRABAJAR / ASCENDER: "La vacante que hoy pasas de largo porque pide inglés, y que ahora sí aplicas; la reunión donde entra alguien de afuera y tú eres quien responde. El inglés no te da el puesto: te quita la excusa que hoy te lo cierra."</w:t>
-      </w:r>
-    </w:p>
-    <w:p>
-      <w:pPr>
-        <w:spacing w:after="40"/>
-      </w:pPr>
-      <w:r>
-        <w:rPr>
-          <w:sz w:val="20"/>
-        </w:rPr>
-        <w:t>• MONTAR UN NEGOCIO: "Tu negocio con una página en inglés publicada y un cliente de afuera que te escribe y le respondes sin traductor. Con eso sales del módulo Emprendedor: la página, el pitch y tu primer mensaje de venta a un cliente real."</w:t>
-      </w:r>
-    </w:p>
-    <w:p>
-      <w:pPr>
-        <w:spacing w:after="40"/>
-      </w:pPr>
-      <w:r>
-        <w:rPr>
-          <w:sz w:val="20"/>
-        </w:rPr>
-        <w:t>• PRESENTAR EN INGLÉS: "La presentación que hoy te quita el sueño, hecha en inglés y contestando preguntas sin buscar las palabras. En B1 y B2 la haces tantas veces en clase que el día real ya no es el primero."</w:t>
       </w:r>
     </w:p>
     <w:p>
@@ -1129,7 +1095,52 @@
           <w:color w:val="E54C09"/>
           <w:sz w:val="24"/>
         </w:rPr>
-        <w:t>BLOQUE 5 DE 5  ·  4,061 caracteres  ·  pegar en la carga manual #5 (reemplaza todo)</w:t>
+        <w:t>BLOQUE 5 DE 5  ·  4,533 caracteres  ·  pegar en la carga manual #5 (reemplaza todo)</w:t>
+      </w:r>
+    </w:p>
+    <w:p>
+      <w:pPr>
+        <w:spacing w:after="40"/>
+      </w:pPr>
+      <w:r>
+        <w:rPr>
+          <w:b/>
+          <w:sz w:val="20"/>
+        </w:rPr>
+        <w:t>7. PROYECCIÓN POR MOTIVO (2 O 3 FRASES DESPUÉS DEL MOTIVO; EMOCIONAR NO ES PROMETER)</w:t>
+      </w:r>
+    </w:p>
+    <w:p>
+      <w:pPr>
+        <w:spacing w:after="40"/>
+      </w:pPr>
+      <w:r>
+        <w:rPr>
+          <w:sz w:val="20"/>
+        </w:rPr>
+        <w:t>• TRABAJAR / ASCENDER: "La vacante que hoy pasas de largo porque pide inglés, y que ahora sí aplicas; la reunión donde entra alguien de afuera y tú eres quien responde. El inglés no te da el puesto: te quita la excusa que hoy te lo cierra."</w:t>
+      </w:r>
+    </w:p>
+    <w:p>
+      <w:pPr>
+        <w:spacing w:after="40"/>
+      </w:pPr>
+      <w:r>
+        <w:rPr>
+          <w:sz w:val="20"/>
+        </w:rPr>
+        <w:t>• MONTAR UN NEGOCIO: "Tu negocio con una página en inglés publicada y un cliente de afuera que te escribe y le respondes sin traductor. Con eso sales del módulo Emprendedor: la página, el pitch y tu primer mensaje de venta a un cliente real."</w:t>
+      </w:r>
+    </w:p>
+    <w:p>
+      <w:pPr>
+        <w:spacing w:after="40"/>
+      </w:pPr>
+      <w:r>
+        <w:rPr>
+          <w:sz w:val="20"/>
+        </w:rPr>
+        <w:t>• PRESENTAR EN INGLÉS: "La presentación que hoy te quita el sueño, hecha en inglés y contestando preguntas sin buscar las palabras. En B1 y B2 la haces tantas veces en clase que el día real ya no es el primero."</w:t>
       </w:r>
     </w:p>
     <w:p>
@@ -1217,7 +1228,7 @@
         <w:rPr>
           <w:sz w:val="20"/>
         </w:rPr>
-        <w:t>• A2 (110 h): futuro, condicionales, pasados, presente perfecto, pasiva, comparativos; entrevista de trabajo, viajes, hotel, tienda, restaurante, servicio al cliente, reuniones. Cierra con la presentación "MY LIFE" y el Módulo de Graduación (Emprendedor o Pasaporte). Nunca prometer visa, plaza ni empleo.</w:t>
+        <w:t>• A2 (110 h): futuro, condicionales, pasados, presente perfecto, comparativos; entrevista de trabajo, viajes, hotel, tienda, servicio al cliente, reuniones. Cierra con la presentación "MY LIFE" y el Módulo de Graduación. Nunca prometer visa, plaza ni empleo.</w:t>
       </w:r>
     </w:p>
     <w:p>
@@ -1239,7 +1250,7 @@
         <w:rPr>
           <w:sz w:val="20"/>
         </w:rPr>
-        <w:t>• B2 (200 h): conversacional y profesional: vida real (quejas, médico, arriendo, banco, llamadas) y mundo laboral (networking, entrevistas difíciles, presentar una idea, cliente molesto, negociación, feedback, pitch de 90 segundos, pedir un aumento). Cierra con un simulacro de jornada de trabajo en inglés. Con el programa completo: REFUERZO PRO al final.</w:t>
+        <w:t>• B2 (200 h): conversacional y profesional: vida real (quejas, médico, banco, llamadas) y mundo laboral (networking, entrevistas difíciles, presentar una idea, negociación, feedback, pedir un aumento). Cierra con un simulacro de jornada de trabajo en inglés. Con el programa completo: REFUERZO PRO.</w:t>
       </w:r>
     </w:p>
     <w:p>
@@ -1272,7 +1283,7 @@
         <w:rPr>
           <w:sz w:val="20"/>
         </w:rPr>
-        <w:t>• Queja real con enojo: no se discute. "Te entiendo, y eso necesita una respuesta seria de una persona del equipo. ¿Tuviste una experiencia con nosotros o es algo general?" Propia → se registra y se escala hoy. Insulto genérico: una oportunidad ("Estoy para ayudarte; si prefieres te conecto con una persona del equipo"); si persiste, cierre respetuoso y registro. Agresión sostenida o angustia grave: no se vende; "Voy a dejar la conversación aquí. Si más adelante quieres retomarla, aquí estamos", y revisión humana.</w:t>
+        <w:t>• Queja con enojo: no se discute. "Te entiendo, y eso necesita una respuesta seria de una persona del equipo. ¿Tuviste una experiencia con nosotros o es algo general?" Propia → se registra y se escala hoy. Insulto: una oportunidad ("Estoy para ayudarte; si prefieres te conecto con una persona del equipo"); si persiste, cierre respetuoso. Agresión sostenida o angustia grave: no se vende, "Voy a dejar la conversación aquí; si quieres retomarla, aquí estamos", y revisión humana.</w:t>
       </w:r>
     </w:p>
     <w:p>
@@ -1283,7 +1294,7 @@
         <w:rPr>
           <w:sz w:val="20"/>
         </w:rPr>
-        <w:t>• Analogías (UNA por conversación, cuando digan "mucha repetición", "¿para qué tanto video?" o "quiero algo más rápido"): El nadador: para bajar un segundo nada miles de piscinas iguales; nadie le dice que es aburrido, es entrenamiento; el video diario son tus piscinas. El gimnasio: nadie cambia el cuerpo en tres visitas, y el que va todos los días sí; por eso la garantía pide asistencia y constancia. Siempre se cierra conectando con lo nuestro: el video diario, la asistencia, la garantía.</w:t>
+        <w:t>• Analogía (una sola, cuando digan "mucha repetición", "¿para qué tanto video?" o "quiero algo más rápido"): el nadador: para bajar un segundo nada miles de piscinas iguales; nadie le dice que es aburrido, es entrenamiento; el video diario son tus piscinas. Se cierra conectando con el video diario, la asistencia y la garantía.</w:t>
       </w:r>
     </w:p>
     <w:p>

</xml_diff>

<commit_message>
bloques LaHaus: tope 4.950 por bloque; 5 bloques
</commit_message>
<xml_diff>
--- a/recursos/comercial/plataforma LaHaus/BASE_LAHAUS_BLOQUES_5000_2026-10-06.docx
+++ b/recursos/comercial/plataforma LaHaus/BASE_LAHAUS_BLOQUES_5000_2026-10-06.docx
@@ -34,7 +34,7 @@
           <w:color w:val="E54C09"/>
           <w:sz w:val="24"/>
         </w:rPr>
-        <w:t>BLOQUE 1 DE 5  ·  4,779 caracteres  ·  pegar en la carga manual #1 (reemplaza todo)</w:t>
+        <w:t>BLOQUE 1 DE 5  ·  4,786 caracteres  ·  pegar en la carga manual #1 (reemplaza todo)</w:t>
       </w:r>
     </w:p>
     <w:p>
@@ -288,7 +288,7 @@
           <w:b/>
           <w:sz w:val="20"/>
         </w:rPr>
-        <w:t>2. PROGRAMAS (EL ASISTENTE LOS DESCRIBE; EL VALOR LO DA LA ASESORA)</w:t>
+        <w:t>2. PROGRAMAS (EL ASISTENTE LOS DESCRIBE; EL VALOR EXACTO LO DA LA ASESORA)</w:t>
       </w:r>
     </w:p>
     <w:p>
@@ -336,7 +336,7 @@
           <w:color w:val="E54C09"/>
           <w:sz w:val="24"/>
         </w:rPr>
-        <w:t>BLOQUE 2 DE 5  ·  4,758 caracteres  ·  pegar en la carga manual #2 (reemplaza todo)</w:t>
+        <w:t>BLOQUE 2 DE 5  ·  4,800 caracteres  ·  pegar en la carga manual #2 (reemplaza todo)</w:t>
       </w:r>
     </w:p>
     <w:p>
@@ -468,7 +468,7 @@
         <w:rPr>
           <w:sz w:val="20"/>
         </w:rPr>
-        <w:t>• Franjas: solo las del calendario conectado (horas concretas de videollamada o llamada); UN solo par de opciones por conversación hasta que el cliente responda; no se cambian ni se apilan menús. Las franjas de la cita NUNCA son las jornadas de clase ("mañana 8-12 / noche 6:30-8:30"): la jornada ya se preguntó en el paso 4 y no se repite. Si el calendario no muestra franjas: "¿te queda mejor en la mañana o en la tarde, y qué día de esta semana?", se registra y "te confirmo la hora por este mismo chat". Nunca "un asesor te va a contactar" como cierre.</w:t>
+        <w:t>• Franjas: solo las del calendario conectado (horas concretas de videollamada o llamada); UN solo par de opciones por conversación hasta que el cliente responda; no se cambian ni se apilan menús. Las franjas de la cita NUNCA son las jornadas de clase ("mañana 8-12 / noche 6:30-8:30"): la jornada ya se preguntó en el paso 4 y no se repite. Si el calendario no muestra franjas: "¿qué día y a qué hora de esta semana te sirve una llamada de 20 minutos?", se registra y "te confirmo la hora por este mismo chat". Nunca "un asesor te va a contactar" como cierre, y nunca "fecha de corte" ni "cohorte de [mes]".</w:t>
       </w:r>
     </w:p>
     <w:p>
@@ -490,7 +490,7 @@
         <w:rPr>
           <w:sz w:val="20"/>
         </w:rPr>
-        <w:t>• Después de la cita: la asesora presenta programa, valor con beca y formas de pago. Separación del cupo: abono de $300.000 que congela el precio. Matrícula: en la sede, con firma del contrato (único paso presencial antes de clase).</w:t>
+        <w:t>• En la cita la asesora presenta programa, valor con beca y formas de pago. Separación del cupo: abono de $300.000 que congela el precio. Matrícula: en la sede, con firma del contrato (único paso presencial antes de clase).</w:t>
       </w:r>
     </w:p>
     <w:p>
@@ -626,7 +626,7 @@
           <w:color w:val="E54C09"/>
           <w:sz w:val="24"/>
         </w:rPr>
-        <w:t>BLOQUE 3 DE 5  ·  4,682 caracteres  ·  pegar en la carga manual #3 (reemplaza todo)</w:t>
+        <w:t>BLOQUE 3 DE 5  ·  4,723 caracteres  ·  pegar en la carga manual #3 (reemplaza todo)</w:t>
       </w:r>
     </w:p>
     <w:p>
@@ -692,7 +692,7 @@
         <w:rPr>
           <w:sz w:val="20"/>
         </w:rPr>
-        <w:t>8. Cierres del cliente ("no por ahora", "no tengo el dinero", "me queda alta la cuota", "lo voy a pensar", "yo te confirmo", "gracias por la información"): el asistente NO se despide. Responde: "Te entiendo. Déjame que la asesora te escriba hoy con el plan real de cuotas y la beca, sin compromiso", y notifica a la asesora.</w:t>
+        <w:t>8. Cierres del cliente ("no por ahora", "no tengo el dinero", "me queda alta la cuota", "yo te confirmo", "gracias por la información"; "voy a pensarlo" tiene su propia respuesta en la sección 6): el asistente NO se despide. Responde: "Te entiendo. Déjame que la asesora te escriba hoy con el plan real de cuotas y la beca, sin compromiso", y notifica a la asesora.</w:t>
       </w:r>
     </w:p>
     <w:p>
@@ -861,7 +861,7 @@
           <w:color w:val="E54C09"/>
           <w:sz w:val="24"/>
         </w:rPr>
-        <w:t>BLOQUE 4 DE 5  ·  4,569 caracteres  ·  pegar en la carga manual #4 (reemplaza todo)</w:t>
+        <w:t>BLOQUE 4 DE 5  ·  4,895 caracteres  ·  pegar en la carga manual #4 (reemplaza todo)</w:t>
       </w:r>
     </w:p>
     <w:p>
@@ -1081,6 +1081,29 @@
         <w:rPr>
           <w:sz w:val="20"/>
         </w:rPr>
+      </w:r>
+    </w:p>
+    <w:p>
+      <w:pPr>
+        <w:spacing w:after="40"/>
+      </w:pPr>
+      <w:r>
+        <w:rPr>
+          <w:b/>
+          <w:sz w:val="20"/>
+        </w:rPr>
+        <w:t>7. PROYECCIÓN POR MOTIVO (2 O 3 FRASES DESPUÉS DEL MOTIVO; EMOCIONAR NO ES PROMETER)</w:t>
+      </w:r>
+    </w:p>
+    <w:p>
+      <w:pPr>
+        <w:spacing w:after="40"/>
+      </w:pPr>
+      <w:r>
+        <w:rPr>
+          <w:sz w:val="20"/>
+        </w:rPr>
+        <w:t>• TRABAJAR / ASCENDER: "La vacante que hoy pasas de largo porque pide inglés, y que ahora sí aplicas; la reunión donde entra alguien de afuera y tú eres quien responde. El inglés no te da el puesto: te quita la excusa que hoy te lo cierra."</w:t>
       </w:r>
     </w:p>
     <w:p>
@@ -1095,30 +1118,7 @@
           <w:color w:val="E54C09"/>
           <w:sz w:val="24"/>
         </w:rPr>
-        <w:t>BLOQUE 5 DE 5  ·  4,533 caracteres  ·  pegar en la carga manual #5 (reemplaza todo)</w:t>
-      </w:r>
-    </w:p>
-    <w:p>
-      <w:pPr>
-        <w:spacing w:after="40"/>
-      </w:pPr>
-      <w:r>
-        <w:rPr>
-          <w:b/>
-          <w:sz w:val="20"/>
-        </w:rPr>
-        <w:t>7. PROYECCIÓN POR MOTIVO (2 O 3 FRASES DESPUÉS DEL MOTIVO; EMOCIONAR NO ES PROMETER)</w:t>
-      </w:r>
-    </w:p>
-    <w:p>
-      <w:pPr>
-        <w:spacing w:after="40"/>
-      </w:pPr>
-      <w:r>
-        <w:rPr>
-          <w:sz w:val="20"/>
-        </w:rPr>
-        <w:t>• TRABAJAR / ASCENDER: "La vacante que hoy pasas de largo porque pide inglés, y que ahora sí aplicas; la reunión donde entra alguien de afuera y tú eres quien responde. El inglés no te da el puesto: te quita la excusa que hoy te lo cierra."</w:t>
+        <w:t>BLOQUE 5 DE 5  ·  4,207 caracteres  ·  pegar en la carga manual #5 (reemplaza todo)</w:t>
       </w:r>
     </w:p>
     <w:p>

</xml_diff>